<commit_message>
docs: add 4 SVG diagrams to rapport + Mentor/Investor dashboards in TODO
</commit_message>
<xml_diff>
--- a/docs/Rapport_Technique_DIAPALER.docx
+++ b/docs/Rapport_Technique_DIAPALER.docx
@@ -16,7 +16,7 @@
     </w:p>
     <w:p>
       <w:pPr>
-        <w:spacing w:after="0" w:before="0"/>
+        <w:spacing w:after="80" w:before="80"/>
         <w:jc w:val="center"/>
       </w:pPr>
       <w:r>
@@ -42,7 +42,7 @@
     </w:p>
     <w:p>
       <w:pPr>
-        <w:spacing w:after="200" w:before="0"/>
+        <w:spacing w:after="200"/>
         <w:jc w:val="center"/>
       </w:pPr>
       <w:r>
@@ -259,7 +259,7 @@
         </w:rPr>
         <w:t xml:space="preserve">Repo : </w:t>
       </w:r>
-      <w:hyperlink w:history="1" r:id="rIdcxhxiagktpbicyy3xnesd">
+      <w:hyperlink w:history="1" r:id="rId4tcumancrzgwl0a9rsprg">
         <w:r>
           <w:rPr>
             <w:color w:val="1E50A0"/>
@@ -423,7 +423,332 @@
           <w:bCs/>
           <w:color w:val="0A234B"/>
         </w:rPr>
-        <w:t xml:space="preserve">2. Stack technique</w:t>
+        <w:t xml:space="preserve">2. Architecture &amp; schémas</w:t>
+      </w:r>
+    </w:p>
+    <w:p>
+      <w:pPr>
+        <w:pStyle w:val="Heading2"/>
+        <w:spacing w:after="120" w:before="280"/>
+      </w:pPr>
+      <w:r>
+        <w:rPr>
+          <w:b/>
+          <w:bCs/>
+          <w:color w:val="0A234B"/>
+        </w:rPr>
+        <w:t xml:space="preserve">2.1 Architecture client / serveur</w:t>
+      </w:r>
+    </w:p>
+    <w:p>
+      <w:pPr>
+        <w:spacing w:after="80" w:before="60"/>
+      </w:pPr>
+      <w:r>
+        <w:rPr>
+          <w:color w:val="0F1729"/>
+        </w:rPr>
+        <w:t xml:space="preserve">L'app Flutter (web Chrome pour la démo, Android prévu Livrable 1) communique avec deux services Firebase. La logique d'accès aux services est isolée dans des wrappers (services/) pour pouvoir évoluer ou tester indépendamment de l'UI.</w:t>
+      </w:r>
+    </w:p>
+    <w:p>
+      <w:pPr>
+        <w:spacing w:after="200" w:before="200"/>
+        <w:jc w:val="center"/>
+      </w:pPr>
+      <w:r>
+        <w:drawing>
+          <wp:inline distT="0" distB="0" distL="0" distR="0">
+            <wp:extent cx="5715000" cy="2381250"/>
+            <wp:effectExtent t="0" r="0" b="0" l="0"/>
+            <wp:docPr id="1" name="Schéma" descr="Schéma DIAPALER" title="Schéma"/>
+            <wp:cNvGraphicFramePr>
+              <a:graphicFrameLocks xmlns:a="http://schemas.openxmlformats.org/drawingml/2006/main" noChangeAspect="1"/>
+            </wp:cNvGraphicFramePr>
+            <a:graphic xmlns:a="http://schemas.openxmlformats.org/drawingml/2006/main">
+              <a:graphicData uri="http://schemas.openxmlformats.org/drawingml/2006/picture">
+                <pic:pic xmlns:pic="http://schemas.openxmlformats.org/drawingml/2006/picture">
+                  <pic:nvPicPr>
+                    <pic:cNvPr id="0" name="" descr=""/>
+                    <pic:cNvPicPr>
+                      <a:picLocks noChangeAspect="1" noChangeArrowheads="1"/>
+                    </pic:cNvPicPr>
+                  </pic:nvPicPr>
+                  <pic:blipFill>
+                    <a:blip r:embed="rId10" cstate="none">
+                      <a:extLst>
+                        <a:ext uri="{96DAC541-7B7A-43D3-8B79-37D633B846F1}">
+                          <asvg:svgBlip xmlns:asvg="http://schemas.microsoft.com/office/drawing/2016/SVG/main" r:embed="rId9"/>
+                        </a:ext>
+                      </a:extLst>
+                    </a:blip>
+                    <a:srcRect/>
+                    <a:stretch>
+                      <a:fillRect/>
+                    </a:stretch>
+                  </pic:blipFill>
+                  <pic:spPr bwMode="auto">
+                    <a:xfrm>
+                      <a:off x="0" y="0"/>
+                      <a:ext cx="5715000" cy="2381250"/>
+                    </a:xfrm>
+                    <a:prstGeom prst="rect">
+                      <a:avLst/>
+                    </a:prstGeom>
+                  </pic:spPr>
+                </pic:pic>
+              </a:graphicData>
+            </a:graphic>
+          </wp:inline>
+        </w:drawing>
+      </w:r>
+    </w:p>
+    <w:p>
+      <w:pPr>
+        <w:pStyle w:val="Heading2"/>
+        <w:spacing w:after="120" w:before="280"/>
+      </w:pPr>
+      <w:r>
+        <w:rPr>
+          <w:b/>
+          <w:bCs/>
+          <w:color w:val="0A234B"/>
+        </w:rPr>
+        <w:t xml:space="preserve">2.2 Flow de navigation des écrans</w:t>
+      </w:r>
+    </w:p>
+    <w:p>
+      <w:pPr>
+        <w:spacing w:after="80" w:before="60"/>
+      </w:pPr>
+      <w:r>
+        <w:rPr>
+          <w:color w:val="0F1729"/>
+        </w:rPr>
+        <w:t xml:space="preserve">Tous les écrans sont accessibles depuis le RootShell (bottom nav 2 onglets + FAB central pour le pitch). Le splash effectue une auto-login si la session est active, sinon route vers la sélection de rôle.</w:t>
+      </w:r>
+    </w:p>
+    <w:p>
+      <w:pPr>
+        <w:spacing w:after="200" w:before="200"/>
+        <w:jc w:val="center"/>
+      </w:pPr>
+      <w:r>
+        <w:drawing>
+          <wp:inline distT="0" distB="0" distL="0" distR="0">
+            <wp:extent cx="5715000" cy="3429000"/>
+            <wp:effectExtent t="0" r="0" b="0" l="0"/>
+            <wp:docPr id="1" name="Schéma" descr="Schéma DIAPALER" title="Schéma"/>
+            <wp:cNvGraphicFramePr>
+              <a:graphicFrameLocks xmlns:a="http://schemas.openxmlformats.org/drawingml/2006/main" noChangeAspect="1"/>
+            </wp:cNvGraphicFramePr>
+            <a:graphic xmlns:a="http://schemas.openxmlformats.org/drawingml/2006/main">
+              <a:graphicData uri="http://schemas.openxmlformats.org/drawingml/2006/picture">
+                <pic:pic xmlns:pic="http://schemas.openxmlformats.org/drawingml/2006/picture">
+                  <pic:nvPicPr>
+                    <pic:cNvPr id="0" name="" descr=""/>
+                    <pic:cNvPicPr>
+                      <a:picLocks noChangeAspect="1" noChangeArrowheads="1"/>
+                    </pic:cNvPicPr>
+                  </pic:nvPicPr>
+                  <pic:blipFill>
+                    <a:blip r:embed="rId12" cstate="none">
+                      <a:extLst>
+                        <a:ext uri="{96DAC541-7B7A-43D3-8B79-37D633B846F1}">
+                          <asvg:svgBlip xmlns:asvg="http://schemas.microsoft.com/office/drawing/2016/SVG/main" r:embed="rId11"/>
+                        </a:ext>
+                      </a:extLst>
+                    </a:blip>
+                    <a:srcRect/>
+                    <a:stretch>
+                      <a:fillRect/>
+                    </a:stretch>
+                  </pic:blipFill>
+                  <pic:spPr bwMode="auto">
+                    <a:xfrm>
+                      <a:off x="0" y="0"/>
+                      <a:ext cx="5715000" cy="3429000"/>
+                    </a:xfrm>
+                    <a:prstGeom prst="rect">
+                      <a:avLst/>
+                    </a:prstGeom>
+                  </pic:spPr>
+                </pic:pic>
+              </a:graphicData>
+            </a:graphic>
+          </wp:inline>
+        </w:drawing>
+      </w:r>
+    </w:p>
+    <w:p>
+      <w:pPr>
+        <w:pStyle w:val="Heading2"/>
+        <w:spacing w:after="120" w:before="280"/>
+      </w:pPr>
+      <w:r>
+        <w:rPr>
+          <w:b/>
+          <w:bCs/>
+          <w:color w:val="0A234B"/>
+        </w:rPr>
+        <w:t xml:space="preserve">2.3 Inscription en 4 étapes</w:t>
+      </w:r>
+    </w:p>
+    <w:p>
+      <w:pPr>
+        <w:spacing w:after="80" w:before="60"/>
+      </w:pPr>
+      <w:r>
+        <w:rPr>
+          <w:color w:val="0F1729"/>
+        </w:rPr>
+        <w:t xml:space="preserve">Pour réduire la charge cognitive, l'inscription est découpée en 4 sections thématiques. Chaque étape valide localement avant de débloquer la suivante. Centres d'intérêt obligatoires (≥ 1) pour permettre le matching personnalisé.</w:t>
+      </w:r>
+    </w:p>
+    <w:p>
+      <w:pPr>
+        <w:spacing w:after="200" w:before="200"/>
+        <w:jc w:val="center"/>
+      </w:pPr>
+      <w:r>
+        <w:drawing>
+          <wp:inline distT="0" distB="0" distL="0" distR="0">
+            <wp:extent cx="5715000" cy="1905000"/>
+            <wp:effectExtent t="0" r="0" b="0" l="0"/>
+            <wp:docPr id="1" name="Schéma" descr="Schéma DIAPALER" title="Schéma"/>
+            <wp:cNvGraphicFramePr>
+              <a:graphicFrameLocks xmlns:a="http://schemas.openxmlformats.org/drawingml/2006/main" noChangeAspect="1"/>
+            </wp:cNvGraphicFramePr>
+            <a:graphic xmlns:a="http://schemas.openxmlformats.org/drawingml/2006/main">
+              <a:graphicData uri="http://schemas.openxmlformats.org/drawingml/2006/picture">
+                <pic:pic xmlns:pic="http://schemas.openxmlformats.org/drawingml/2006/picture">
+                  <pic:nvPicPr>
+                    <pic:cNvPr id="0" name="" descr=""/>
+                    <pic:cNvPicPr>
+                      <a:picLocks noChangeAspect="1" noChangeArrowheads="1"/>
+                    </pic:cNvPicPr>
+                  </pic:nvPicPr>
+                  <pic:blipFill>
+                    <a:blip r:embed="rId14" cstate="none">
+                      <a:extLst>
+                        <a:ext uri="{96DAC541-7B7A-43D3-8B79-37D633B846F1}">
+                          <asvg:svgBlip xmlns:asvg="http://schemas.microsoft.com/office/drawing/2016/SVG/main" r:embed="rId13"/>
+                        </a:ext>
+                      </a:extLst>
+                    </a:blip>
+                    <a:srcRect/>
+                    <a:stretch>
+                      <a:fillRect/>
+                    </a:stretch>
+                  </pic:blipFill>
+                  <pic:spPr bwMode="auto">
+                    <a:xfrm>
+                      <a:off x="0" y="0"/>
+                      <a:ext cx="5715000" cy="1905000"/>
+                    </a:xfrm>
+                    <a:prstGeom prst="rect">
+                      <a:avLst/>
+                    </a:prstGeom>
+                  </pic:spPr>
+                </pic:pic>
+              </a:graphicData>
+            </a:graphic>
+          </wp:inline>
+        </w:drawing>
+      </w:r>
+    </w:p>
+    <w:p>
+      <w:pPr>
+        <w:pStyle w:val="Heading2"/>
+        <w:spacing w:after="120" w:before="280"/>
+      </w:pPr>
+      <w:r>
+        <w:rPr>
+          <w:b/>
+          <w:bCs/>
+          <w:color w:val="0A234B"/>
+        </w:rPr>
+        <w:t xml:space="preserve">2.4 Algorithme de recommandation</w:t>
+      </w:r>
+    </w:p>
+    <w:p>
+      <w:pPr>
+        <w:spacing w:after="80" w:before="60"/>
+      </w:pPr>
+      <w:r>
+        <w:rPr>
+          <w:color w:val="0F1729"/>
+        </w:rPr>
+        <w:t xml:space="preserve">Les mentors recommandés sur le dashboard sont calculés en live à partir de trois sources combinées dans le profil utilisateur : le secteur déclaré, les secteurs des projets actifs et les centres d'intérêt.</w:t>
+      </w:r>
+    </w:p>
+    <w:p>
+      <w:pPr>
+        <w:spacing w:after="200" w:before="200"/>
+        <w:jc w:val="center"/>
+      </w:pPr>
+      <w:r>
+        <w:drawing>
+          <wp:inline distT="0" distB="0" distL="0" distR="0">
+            <wp:extent cx="5715000" cy="2667000"/>
+            <wp:effectExtent t="0" r="0" b="0" l="0"/>
+            <wp:docPr id="1" name="Schéma" descr="Schéma DIAPALER" title="Schéma"/>
+            <wp:cNvGraphicFramePr>
+              <a:graphicFrameLocks xmlns:a="http://schemas.openxmlformats.org/drawingml/2006/main" noChangeAspect="1"/>
+            </wp:cNvGraphicFramePr>
+            <a:graphic xmlns:a="http://schemas.openxmlformats.org/drawingml/2006/main">
+              <a:graphicData uri="http://schemas.openxmlformats.org/drawingml/2006/picture">
+                <pic:pic xmlns:pic="http://schemas.openxmlformats.org/drawingml/2006/picture">
+                  <pic:nvPicPr>
+                    <pic:cNvPr id="0" name="" descr=""/>
+                    <pic:cNvPicPr>
+                      <a:picLocks noChangeAspect="1" noChangeArrowheads="1"/>
+                    </pic:cNvPicPr>
+                  </pic:nvPicPr>
+                  <pic:blipFill>
+                    <a:blip r:embed="rId16" cstate="none">
+                      <a:extLst>
+                        <a:ext uri="{96DAC541-7B7A-43D3-8B79-37D633B846F1}">
+                          <asvg:svgBlip xmlns:asvg="http://schemas.microsoft.com/office/drawing/2016/SVG/main" r:embed="rId15"/>
+                        </a:ext>
+                      </a:extLst>
+                    </a:blip>
+                    <a:srcRect/>
+                    <a:stretch>
+                      <a:fillRect/>
+                    </a:stretch>
+                  </pic:blipFill>
+                  <pic:spPr bwMode="auto">
+                    <a:xfrm>
+                      <a:off x="0" y="0"/>
+                      <a:ext cx="5715000" cy="2667000"/>
+                    </a:xfrm>
+                    <a:prstGeom prst="rect">
+                      <a:avLst/>
+                    </a:prstGeom>
+                  </pic:spPr>
+                </pic:pic>
+              </a:graphicData>
+            </a:graphic>
+          </wp:inline>
+        </w:drawing>
+      </w:r>
+    </w:p>
+    <w:p>
+      <w:pPr>
+        <w:pStyle w:val="Heading1"/>
+        <w:pBdr>
+          <w:bottom w:val="single" w:color="F59E0B" w:sz="8" w:space="4"/>
+        </w:pBdr>
+        <w:spacing w:after="200" w:before="360"/>
+      </w:pPr>
+      <w:r>
+        <w:rPr>
+          <w:b/>
+          <w:bCs/>
+          <w:color w:val="0A234B"/>
+        </w:rPr>
+        <w:t xml:space="preserve">3. Stack technique</w:t>
       </w:r>
     </w:p>
     <w:tbl>
@@ -1207,7 +1532,7 @@
           <w:bCs/>
           <w:color w:val="0A234B"/>
         </w:rPr>
-        <w:t xml:space="preserve">3. Structure du code</w:t>
+        <w:t xml:space="preserve">4. Structure du code</w:t>
       </w:r>
     </w:p>
     <w:p>
@@ -1219,20 +1544,6 @@
           <w:color w:val="0F1729"/>
         </w:rPr>
         <w:t xml:space="preserve">Tout est dans le dossier lib/. Pas de sur-engineering : un fichier par écran, un fichier par widget réutilisable. Les services Firebase sont isolés dans services/.</w:t>
-      </w:r>
-    </w:p>
-    <w:p>
-      <w:pPr>
-        <w:pStyle w:val="Heading2"/>
-        <w:spacing w:after="120" w:before="280"/>
-      </w:pPr>
-      <w:r>
-        <w:rPr>
-          <w:b/>
-          <w:bCs/>
-          <w:color w:val="0A234B"/>
-        </w:rPr>
-        <w:t xml:space="preserve">3.1 Arborescence</w:t>
       </w:r>
     </w:p>
     <w:p>
@@ -1260,41 +1571,41 @@
 ├── theme/
 │   └── app_theme.dart           AppColors (drapeau Sénégal) + ThemeData light
 ├── data/
-│   ├── user_profile.dart        Modèle UserProfile, Project, Gender + UserProfileController
+│   ├── user_profile.dart        Modèle UserProfile, Project, Gender + Controller
 │   ├── mock_data.dart           12 mentors sénégalais + recommendedMentorsFor()
-│   ├── countries.dart           Pays/villes (Sénégal/Gambie/Mali) + ageFromBirthDate()
-│   └── quotes.dart              8 citations (proverbes wolof + entrepreneurs panafricains)
+│   ├── countries.dart           Pays/villes (Sénégal/Gambie/Mali)
+│   └── quotes.dart              8 citations (proverbes wolof + entrepreneurs)
 ├── services/
 │   ├── auth_service.dart        Wrapper FirebaseAuth + erreurs FR
 │   └── database_service.dart    CRUD profil sur Realtime Database
 ├── screens/                     11 pages
-│   ├── splash_page.dart         Anim 1.1s + Firebase init + auto-login
-│   ├── role_selection_page.dart Choix du rôle (Entrepreneur / Mentor / Investor)
-│   ├── login_page.dart          Connexion (hero navy + gradient button)
-│   ├── signup_page.dart         Inscription en 4 étapes avec validations live
-│   ├── onboarding_page.dart     3 slides après signup
-│   ├── root_shell.dart          Bottom-nav + IndexedStack + FAB pitch
-│   ├── home_page.dart           Dashboard avec stats dynamiques
-│   ├── matching_page.dart       Recherche mentors + filtres
-│   ├── mentor_detail_page.dart  Hero + stats + entreprises + slots
-│   ├── profile_page.dart        Mon profil compact
-│   ├── edit_profile_page.dart   Modifier (cascade pays/ville)
-│   ├── add_project_page.dart    Nouveau projet (nom + secteur + desc)
-│   └── pitch_page.dart          Stepper 3 étapes pour déposer un pitch
+│   ├── splash_page.dart
+│   ├── role_selection_page.dart
+│   ├── login_page.dart
+│   ├── signup_page.dart
+│   ├── onboarding_page.dart
+│   ├── root_shell.dart
+│   ├── home_page.dart
+│   ├── matching_page.dart
+│   ├── mentor_detail_page.dart
+│   ├── profile_page.dart
+│   ├── edit_profile_page.dart
+│   ├── add_project_page.dart
+│   └── pitch_page.dart
 └── widgets/                     13 widgets partagés
-    ├── animated_counter.dart    Compteur 0 → valeur (Tween 1.1s)
-    ├── avatar.dart              Avatar circulaire + indicateur en ligne
-    ├── bottom_nav.dart          BottomAppBar 2 onglets + notch FAB
-    ├── cursor_follower.dart     Traînée d'étoiles drapeau qui suit la souris
-    ├── diapaler_logo.dart       LogoTile (handshake + orbites) + Wordmark drapeau
-    ├── flag_strip.dart          3 lignes drapeau Sénégal
-    ├── hover_glow_card.dart     Scale + shadow ambre au hover
-    ├── mentor_card.dart         Card mentor avec badge CIS + score
-    ├── profile_sheet.dart       Bottom sheet profil + logout
-    ├── quote_carousel.dart      Carousel auto-rotatif (5s)
-    ├── rotating_tagline.dart    Citation alternée sous le greeting
-    ├── section_header.dart      Titre + lien d'action
-    └── skeleton.dart            Boîtes shimmer + MentorCardSkeleton</w:t>
+    ├── animated_counter.dart
+    ├── avatar.dart
+    ├── bottom_nav.dart
+    ├── cursor_follower.dart
+    ├── diapaler_logo.dart
+    ├── flag_strip.dart
+    ├── hover_glow_card.dart
+    ├── mentor_card.dart
+    ├── profile_sheet.dart
+    ├── quote_carousel.dart
+    ├── rotating_tagline.dart
+    ├── section_header.dart
+    └── skeleton.dart</w:t>
       </w:r>
     </w:p>
     <w:p>
@@ -1311,7 +1622,7 @@
           <w:bCs/>
           <w:color w:val="0A234B"/>
         </w:rPr>
-        <w:t xml:space="preserve">4. Fonctionnalités livrées</w:t>
+        <w:t xml:space="preserve">5. Fonctionnalités livrées</w:t>
       </w:r>
     </w:p>
     <w:p>
@@ -1325,7 +1636,7 @@
           <w:bCs/>
           <w:color w:val="0A234B"/>
         </w:rPr>
-        <w:t xml:space="preserve">4.1 Authentification (Firebase Auth)</w:t>
+        <w:t xml:space="preserve">5.1 Authentification (Firebase Auth)</w:t>
       </w:r>
     </w:p>
     <w:p>
@@ -1447,7 +1758,7 @@
           <w:bCs/>
           <w:color w:val="0A234B"/>
         </w:rPr>
-        <w:t xml:space="preserve">4.2 Inscription en 4 étapes</w:t>
+        <w:t xml:space="preserve">5.2 Inscription Entrepreneur (4 étapes)</w:t>
       </w:r>
     </w:p>
     <w:tbl>
@@ -1974,18 +2285,6 @@
     </w:tbl>
     <w:p>
       <w:pPr>
-        <w:spacing w:before="200"/>
-      </w:pPr>
-      <w:r>
-        <w:rPr>
-          <w:sz w:val="22"/>
-          <w:szCs w:val="22"/>
-        </w:rPr>
-        <w:t xml:space="preserve"/>
-      </w:r>
-    </w:p>
-    <w:p>
-      <w:pPr>
         <w:pStyle w:val="Heading3"/>
         <w:spacing w:after="100" w:before="200"/>
       </w:pPr>
@@ -2090,31 +2389,6 @@
     </w:p>
     <w:p>
       <w:pPr>
-        <w:pStyle w:val="Heading3"/>
-        <w:spacing w:after="100" w:before="200"/>
-      </w:pPr>
-      <w:r>
-        <w:rPr>
-          <w:b/>
-          <w:bCs/>
-          <w:color w:val="1E50A0"/>
-        </w:rPr>
-        <w:t xml:space="preserve">Mentor / Investisseur</w:t>
-      </w:r>
-    </w:p>
-    <w:p>
-      <w:pPr>
-        <w:spacing w:after="80" w:before="60"/>
-      </w:pPr>
-      <w:r>
-        <w:rPr>
-          <w:color w:val="0F1729"/>
-        </w:rPr>
-        <w:t xml:space="preserve">Pour limiter le périmètre du Livrable 0, l'inscription pour ces 2 rôles est désactivée : le formulaire devient vide quand le pill est sélectionné, et le bouton CONTINUER reste grisé. Implémentation à compléter au Livrable 1.</w:t>
-      </w:r>
-    </w:p>
-    <w:p>
-      <w:pPr>
         <w:pStyle w:val="Heading2"/>
         <w:spacing w:after="120" w:before="280"/>
       </w:pPr>
@@ -2124,7 +2398,7 @@
           <w:bCs/>
           <w:color w:val="0A234B"/>
         </w:rPr>
-        <w:t xml:space="preserve">4.3 Profil utilisateur (Realtime Database)</w:t>
+        <w:t xml:space="preserve">5.3 Profil utilisateur (Realtime Database)</w:t>
       </w:r>
     </w:p>
     <w:p>
@@ -2234,7 +2508,7 @@
           <w:bCs/>
           <w:color w:val="0A234B"/>
         </w:rPr>
-        <w:t xml:space="preserve">4.4 Multi-projets</w:t>
+        <w:t xml:space="preserve">5.4 Multi-projets</w:t>
       </w:r>
     </w:p>
     <w:p>
@@ -2338,7 +2612,7 @@
           <w:bCs/>
           <w:color w:val="0A234B"/>
         </w:rPr>
-        <w:t xml:space="preserve">4.5 Dashboard</w:t>
+        <w:t xml:space="preserve">5.5 Dashboard Entrepreneur</w:t>
       </w:r>
     </w:p>
     <w:p>
@@ -2496,7 +2770,7 @@
           <w:bCs/>
           <w:color w:val="0A234B"/>
         </w:rPr>
-        <w:t xml:space="preserve">4.6 Matching</w:t>
+        <w:t xml:space="preserve">5.6 Matching</w:t>
       </w:r>
     </w:p>
     <w:p>
@@ -2618,7 +2892,7 @@
           <w:bCs/>
           <w:color w:val="0A234B"/>
         </w:rPr>
-        <w:t xml:space="preserve">4.7 Pitch deck</w:t>
+        <w:t xml:space="preserve">5.7 Pitch deck</w:t>
       </w:r>
     </w:p>
     <w:p>
@@ -2704,7 +2978,7 @@
           <w:bCs/>
           <w:color w:val="0A234B"/>
         </w:rPr>
-        <w:t xml:space="preserve">4.8 UX premium</w:t>
+        <w:t xml:space="preserve">5.8 UX premium</w:t>
       </w:r>
     </w:p>
     <w:p>
@@ -2898,7 +3172,7 @@
           <w:bCs/>
           <w:color w:val="0A234B"/>
         </w:rPr>
-        <w:t xml:space="preserve">4.9 Branch protection GitHub</w:t>
+        <w:t xml:space="preserve">5.9 Branch protection GitHub</w:t>
       </w:r>
     </w:p>
     <w:p>
@@ -3005,7 +3279,7 @@
           <w:bCs/>
           <w:color w:val="0A234B"/>
         </w:rPr>
-        <w:t xml:space="preserve">5. Reste à faire</w:t>
+        <w:t xml:space="preserve">6. Reste à faire</w:t>
       </w:r>
     </w:p>
     <w:p>
@@ -3016,7 +3290,7 @@
         <w:rPr>
           <w:color w:val="0F1729"/>
         </w:rPr>
-        <w:t xml:space="preserve">Périmètre découpé par échéance. Les TODO les plus urgents sont en haut. Les statuts utilisent un code couleur : rouge (bloquant pour la prochaine livraison), ambre (important), gris (nice to have).</w:t>
+        <w:t xml:space="preserve">Périmètre découpé par échéance. Les TODO les plus urgents sont en haut. Le code couleur du tableau : rouge = bloquant pour la prochaine livraison, ambre = important, gris = nice to have.</w:t>
       </w:r>
     </w:p>
     <w:p>
@@ -3030,7 +3304,7 @@
           <w:bCs/>
           <w:color w:val="0A234B"/>
         </w:rPr>
-        <w:t xml:space="preserve">5.1 Court terme — Livrable 1</w:t>
+        <w:t xml:space="preserve">6.1 Court terme — Livrable 1</w:t>
       </w:r>
     </w:p>
     <w:tbl>
@@ -3285,7 +3559,7 @@
                 <w:sz w:val="21"/>
                 <w:szCs w:val="21"/>
               </w:rPr>
-              <w:t xml:space="preserve">Vraie messagerie temps réel</w:t>
+              <w:t xml:space="preserve">Dashboard Mentor (vue dédiée)</w:t>
             </w:r>
           </w:p>
         </w:tc>
@@ -3349,7 +3623,7 @@
                 <w:sz w:val="21"/>
                 <w:szCs w:val="21"/>
               </w:rPr>
-              <w:t xml:space="preserve">Page conversations + chat. Firebase Realtime DB ou Firestore selon volume</w:t>
+              <w:t xml:space="preserve">Mes mentees, demandes en attente, sessions à venir, mes pitchs reçus</w:t>
             </w:r>
           </w:p>
         </w:tc>
@@ -3385,7 +3659,7 @@
                 <w:sz w:val="21"/>
                 <w:szCs w:val="21"/>
               </w:rPr>
-              <w:t xml:space="preserve">Dépôt de pitch persistant</w:t>
+              <w:t xml:space="preserve">Dashboard Investisseur (vue dédiée)</w:t>
             </w:r>
           </w:p>
         </w:tc>
@@ -3449,7 +3723,7 @@
                 <w:sz w:val="21"/>
                 <w:szCs w:val="21"/>
               </w:rPr>
-              <w:t xml:space="preserve">Stocker dans /pitches/{pitchId}, lier à user.projects, upload PDF via Firebase Storage</w:t>
+              <w:t xml:space="preserve">Pitchs à étudier, portefeuille, ROI, mes investissements en cours</w:t>
             </w:r>
           </w:p>
         </w:tc>
@@ -3485,7 +3759,7 @@
                 <w:sz w:val="21"/>
                 <w:szCs w:val="21"/>
               </w:rPr>
-              <w:t xml:space="preserve">Upload photo de profil</w:t>
+              <w:t xml:space="preserve">Vraie messagerie temps réel</w:t>
             </w:r>
           </w:p>
         </w:tc>
@@ -3498,25 +3772,27 @@
               <w:bottom w:val="single" w:color="E5E7EB" w:sz="4"/>
               <w:right w:val="single" w:color="E5E7EB" w:sz="4"/>
             </w:tcBorders>
-            <w:shd w:fill="FEF3C7" w:val="clear"/>
-            <w:tcMar>
-              <w:top w:type="dxa" w:w="100"/>
-              <w:left w:type="dxa" w:w="140"/>
-              <w:bottom w:type="dxa" w:w="100"/>
-              <w:right w:type="dxa" w:w="140"/>
-            </w:tcMar>
-          </w:tcPr>
-          <w:p>
-            <w:pPr>
-              <w:spacing w:after="80" w:before="80"/>
-            </w:pPr>
-            <w:r>
-              <w:rPr>
-                <w:color w:val="0F1729"/>
-                <w:sz w:val="21"/>
-                <w:szCs w:val="21"/>
-              </w:rPr>
-              <w:t xml:space="preserve">MOYENNE</w:t>
+            <w:shd w:fill="FEE2E2" w:val="clear"/>
+            <w:tcMar>
+              <w:top w:type="dxa" w:w="100"/>
+              <w:left w:type="dxa" w:w="140"/>
+              <w:bottom w:type="dxa" w:w="100"/>
+              <w:right w:type="dxa" w:w="140"/>
+            </w:tcMar>
+          </w:tcPr>
+          <w:p>
+            <w:pPr>
+              <w:spacing w:after="80" w:before="80"/>
+            </w:pPr>
+            <w:r>
+              <w:rPr>
+                <w:b/>
+                <w:bCs/>
+                <w:color w:val="0F1729"/>
+                <w:sz w:val="21"/>
+                <w:szCs w:val="21"/>
+              </w:rPr>
+              <w:t xml:space="preserve">HAUTE</w:t>
             </w:r>
           </w:p>
         </w:tc>
@@ -3547,7 +3823,7 @@
                 <w:sz w:val="21"/>
                 <w:szCs w:val="21"/>
               </w:rPr>
-              <w:t xml:space="preserve">Firebase Storage + remplacer Avatar initials par CachedNetworkImage</w:t>
+              <w:t xml:space="preserve">Page conversations + chat. Firebase Realtime DB ou Firestore selon volume</w:t>
             </w:r>
           </w:p>
         </w:tc>
@@ -3583,7 +3859,7 @@
                 <w:sz w:val="21"/>
                 <w:szCs w:val="21"/>
               </w:rPr>
-              <w:t xml:space="preserve">Système de favoris fonctionnel</w:t>
+              <w:t xml:space="preserve">Dépôt de pitch persistant</w:t>
             </w:r>
           </w:p>
         </w:tc>
@@ -3596,25 +3872,27 @@
               <w:bottom w:val="single" w:color="E5E7EB" w:sz="4"/>
               <w:right w:val="single" w:color="E5E7EB" w:sz="4"/>
             </w:tcBorders>
-            <w:shd w:fill="FEF3C7" w:val="clear"/>
-            <w:tcMar>
-              <w:top w:type="dxa" w:w="100"/>
-              <w:left w:type="dxa" w:w="140"/>
-              <w:bottom w:type="dxa" w:w="100"/>
-              <w:right w:type="dxa" w:w="140"/>
-            </w:tcMar>
-          </w:tcPr>
-          <w:p>
-            <w:pPr>
-              <w:spacing w:after="80" w:before="80"/>
-            </w:pPr>
-            <w:r>
-              <w:rPr>
-                <w:color w:val="0F1729"/>
-                <w:sz w:val="21"/>
-                <w:szCs w:val="21"/>
-              </w:rPr>
-              <w:t xml:space="preserve">MOYENNE</w:t>
+            <w:shd w:fill="FEE2E2" w:val="clear"/>
+            <w:tcMar>
+              <w:top w:type="dxa" w:w="100"/>
+              <w:left w:type="dxa" w:w="140"/>
+              <w:bottom w:type="dxa" w:w="100"/>
+              <w:right w:type="dxa" w:w="140"/>
+            </w:tcMar>
+          </w:tcPr>
+          <w:p>
+            <w:pPr>
+              <w:spacing w:after="80" w:before="80"/>
+            </w:pPr>
+            <w:r>
+              <w:rPr>
+                <w:b/>
+                <w:bCs/>
+                <w:color w:val="0F1729"/>
+                <w:sz w:val="21"/>
+                <w:szCs w:val="21"/>
+              </w:rPr>
+              <w:t xml:space="preserve">HAUTE</w:t>
             </w:r>
           </w:p>
         </w:tc>
@@ -3645,7 +3923,7 @@
                 <w:sz w:val="21"/>
                 <w:szCs w:val="21"/>
               </w:rPr>
-              <w:t xml:space="preserve">Toggle bookmark sur mentor → /users/{uid}/favorites</w:t>
+              <w:t xml:space="preserve">Stocker dans /pitches/{pitchId}, lier à user.projects, upload PDF via Storage</w:t>
             </w:r>
           </w:p>
         </w:tc>
@@ -3681,7 +3959,7 @@
                 <w:sz w:val="21"/>
                 <w:szCs w:val="21"/>
               </w:rPr>
-              <w:t xml:space="preserve">Réservation de session mentor</w:t>
+              <w:t xml:space="preserve">Upload photo de profil</w:t>
             </w:r>
           </w:p>
         </w:tc>
@@ -3743,7 +4021,7 @@
                 <w:sz w:val="21"/>
                 <w:szCs w:val="21"/>
               </w:rPr>
-              <w:t xml:space="preserve">Page calendrier réelle + node /sessions avec slot, confirmation</w:t>
+              <w:t xml:space="preserve">Firebase Storage + remplacer Avatar initials par CachedNetworkImage</w:t>
             </w:r>
           </w:p>
         </w:tc>
@@ -3779,7 +4057,7 @@
                 <w:sz w:val="21"/>
                 <w:szCs w:val="21"/>
               </w:rPr>
-              <w:t xml:space="preserve">Notifications push (FCM)</w:t>
+              <w:t xml:space="preserve">Système de favoris fonctionnel</w:t>
             </w:r>
           </w:p>
         </w:tc>
@@ -3841,7 +4119,7 @@
                 <w:sz w:val="21"/>
                 <w:szCs w:val="21"/>
               </w:rPr>
-              <w:t xml:space="preserve">Firebase Cloud Messaging — token par device + topic par rôle</w:t>
+              <w:t xml:space="preserve">Toggle bookmark sur mentor → /users/{uid}/favorites</w:t>
             </w:r>
           </w:p>
         </w:tc>
@@ -3877,6 +4155,202 @@
                 <w:sz w:val="21"/>
                 <w:szCs w:val="21"/>
               </w:rPr>
+              <w:t xml:space="preserve">Réservation de session mentor</w:t>
+            </w:r>
+          </w:p>
+        </w:tc>
+        <w:tc>
+          <w:tcPr>
+            <w:tcW w:type="dxa" w:w="1700"/>
+            <w:tcBorders>
+              <w:top w:val="single" w:color="E5E7EB" w:sz="4"/>
+              <w:left w:val="single" w:color="E5E7EB" w:sz="4"/>
+              <w:bottom w:val="single" w:color="E5E7EB" w:sz="4"/>
+              <w:right w:val="single" w:color="E5E7EB" w:sz="4"/>
+            </w:tcBorders>
+            <w:shd w:fill="FEF3C7" w:val="clear"/>
+            <w:tcMar>
+              <w:top w:type="dxa" w:w="100"/>
+              <w:left w:type="dxa" w:w="140"/>
+              <w:bottom w:type="dxa" w:w="100"/>
+              <w:right w:type="dxa" w:w="140"/>
+            </w:tcMar>
+          </w:tcPr>
+          <w:p>
+            <w:pPr>
+              <w:spacing w:after="80" w:before="80"/>
+            </w:pPr>
+            <w:r>
+              <w:rPr>
+                <w:color w:val="0F1729"/>
+                <w:sz w:val="21"/>
+                <w:szCs w:val="21"/>
+              </w:rPr>
+              <w:t xml:space="preserve">MOYENNE</w:t>
+            </w:r>
+          </w:p>
+        </w:tc>
+        <w:tc>
+          <w:tcPr>
+            <w:tcW w:type="dxa" w:w="4160"/>
+            <w:tcBorders>
+              <w:top w:val="single" w:color="E5E7EB" w:sz="4"/>
+              <w:left w:val="single" w:color="E5E7EB" w:sz="4"/>
+              <w:bottom w:val="single" w:color="E5E7EB" w:sz="4"/>
+              <w:right w:val="single" w:color="E5E7EB" w:sz="4"/>
+            </w:tcBorders>
+            <w:shd w:fill="FFFFFF" w:val="clear"/>
+            <w:tcMar>
+              <w:top w:type="dxa" w:w="100"/>
+              <w:left w:type="dxa" w:w="140"/>
+              <w:bottom w:type="dxa" w:w="100"/>
+              <w:right w:type="dxa" w:w="140"/>
+            </w:tcMar>
+          </w:tcPr>
+          <w:p>
+            <w:pPr>
+              <w:spacing w:after="80" w:before="80"/>
+            </w:pPr>
+            <w:r>
+              <w:rPr>
+                <w:color w:val="0F1729"/>
+                <w:sz w:val="21"/>
+                <w:szCs w:val="21"/>
+              </w:rPr>
+              <w:t xml:space="preserve">Page calendrier réelle + node /sessions avec slot, confirmation</w:t>
+            </w:r>
+          </w:p>
+        </w:tc>
+      </w:tr>
+      <w:tr>
+        <w:trPr>
+          <w:tblHeader w:val="false"/>
+        </w:trPr>
+        <w:tc>
+          <w:tcPr>
+            <w:tcW w:type="dxa" w:w="3500"/>
+            <w:tcBorders>
+              <w:top w:val="single" w:color="E5E7EB" w:sz="4"/>
+              <w:left w:val="single" w:color="E5E7EB" w:sz="4"/>
+              <w:bottom w:val="single" w:color="E5E7EB" w:sz="4"/>
+              <w:right w:val="single" w:color="E5E7EB" w:sz="4"/>
+            </w:tcBorders>
+            <w:shd w:fill="FFFFFF" w:val="clear"/>
+            <w:tcMar>
+              <w:top w:type="dxa" w:w="100"/>
+              <w:left w:type="dxa" w:w="140"/>
+              <w:bottom w:type="dxa" w:w="100"/>
+              <w:right w:type="dxa" w:w="140"/>
+            </w:tcMar>
+          </w:tcPr>
+          <w:p>
+            <w:pPr>
+              <w:spacing w:after="80" w:before="80"/>
+            </w:pPr>
+            <w:r>
+              <w:rPr>
+                <w:color w:val="0F1729"/>
+                <w:sz w:val="21"/>
+                <w:szCs w:val="21"/>
+              </w:rPr>
+              <w:t xml:space="preserve">Notifications push (FCM)</w:t>
+            </w:r>
+          </w:p>
+        </w:tc>
+        <w:tc>
+          <w:tcPr>
+            <w:tcW w:type="dxa" w:w="1700"/>
+            <w:tcBorders>
+              <w:top w:val="single" w:color="E5E7EB" w:sz="4"/>
+              <w:left w:val="single" w:color="E5E7EB" w:sz="4"/>
+              <w:bottom w:val="single" w:color="E5E7EB" w:sz="4"/>
+              <w:right w:val="single" w:color="E5E7EB" w:sz="4"/>
+            </w:tcBorders>
+            <w:shd w:fill="FEF3C7" w:val="clear"/>
+            <w:tcMar>
+              <w:top w:type="dxa" w:w="100"/>
+              <w:left w:type="dxa" w:w="140"/>
+              <w:bottom w:type="dxa" w:w="100"/>
+              <w:right w:type="dxa" w:w="140"/>
+            </w:tcMar>
+          </w:tcPr>
+          <w:p>
+            <w:pPr>
+              <w:spacing w:after="80" w:before="80"/>
+            </w:pPr>
+            <w:r>
+              <w:rPr>
+                <w:color w:val="0F1729"/>
+                <w:sz w:val="21"/>
+                <w:szCs w:val="21"/>
+              </w:rPr>
+              <w:t xml:space="preserve">MOYENNE</w:t>
+            </w:r>
+          </w:p>
+        </w:tc>
+        <w:tc>
+          <w:tcPr>
+            <w:tcW w:type="dxa" w:w="4160"/>
+            <w:tcBorders>
+              <w:top w:val="single" w:color="E5E7EB" w:sz="4"/>
+              <w:left w:val="single" w:color="E5E7EB" w:sz="4"/>
+              <w:bottom w:val="single" w:color="E5E7EB" w:sz="4"/>
+              <w:right w:val="single" w:color="E5E7EB" w:sz="4"/>
+            </w:tcBorders>
+            <w:shd w:fill="FFFFFF" w:val="clear"/>
+            <w:tcMar>
+              <w:top w:type="dxa" w:w="100"/>
+              <w:left w:type="dxa" w:w="140"/>
+              <w:bottom w:type="dxa" w:w="100"/>
+              <w:right w:type="dxa" w:w="140"/>
+            </w:tcMar>
+          </w:tcPr>
+          <w:p>
+            <w:pPr>
+              <w:spacing w:after="80" w:before="80"/>
+            </w:pPr>
+            <w:r>
+              <w:rPr>
+                <w:color w:val="0F1729"/>
+                <w:sz w:val="21"/>
+                <w:szCs w:val="21"/>
+              </w:rPr>
+              <w:t xml:space="preserve">Firebase Cloud Messaging — token par device + topic par rôle</w:t>
+            </w:r>
+          </w:p>
+        </w:tc>
+      </w:tr>
+      <w:tr>
+        <w:trPr>
+          <w:tblHeader w:val="false"/>
+        </w:trPr>
+        <w:tc>
+          <w:tcPr>
+            <w:tcW w:type="dxa" w:w="3500"/>
+            <w:tcBorders>
+              <w:top w:val="single" w:color="E5E7EB" w:sz="4"/>
+              <w:left w:val="single" w:color="E5E7EB" w:sz="4"/>
+              <w:bottom w:val="single" w:color="E5E7EB" w:sz="4"/>
+              <w:right w:val="single" w:color="E5E7EB" w:sz="4"/>
+            </w:tcBorders>
+            <w:shd w:fill="FFFFFF" w:val="clear"/>
+            <w:tcMar>
+              <w:top w:type="dxa" w:w="100"/>
+              <w:left w:type="dxa" w:w="140"/>
+              <w:bottom w:type="dxa" w:w="100"/>
+              <w:right w:type="dxa" w:w="140"/>
+            </w:tcMar>
+          </w:tcPr>
+          <w:p>
+            <w:pPr>
+              <w:spacing w:after="80" w:before="80"/>
+            </w:pPr>
+            <w:r>
+              <w:rPr>
+                <w:color w:val="0F1729"/>
+                <w:sz w:val="21"/>
+                <w:szCs w:val="21"/>
+              </w:rPr>
               <w:t xml:space="preserve">Mode sombre (réactiver)</w:t>
             </w:r>
           </w:p>
@@ -3956,7 +4430,7 @@
           <w:bCs/>
           <w:color w:val="0A234B"/>
         </w:rPr>
-        <w:t xml:space="preserve">5.2 Moyen terme — Livrable 2</w:t>
+        <w:t xml:space="preserve">6.2 Moyen terme — Livrable 2</w:t>
       </w:r>
     </w:p>
     <w:p>
@@ -4114,7 +4588,7 @@
           <w:bCs/>
           <w:color w:val="0A234B"/>
         </w:rPr>
-        <w:t xml:space="preserve">5.3 Long terme — Vision Livrable 3+</w:t>
+        <w:t xml:space="preserve">6.3 Long terme — Vision Livrable 3+</w:t>
       </w:r>
     </w:p>
     <w:p>
@@ -4275,7 +4749,7 @@
           <w:bCs/>
           <w:color w:val="0A234B"/>
         </w:rPr>
-        <w:t xml:space="preserve">6. Workflow équipe</w:t>
+        <w:t xml:space="preserve">7. Workflow équipe</w:t>
       </w:r>
     </w:p>
     <w:p>
@@ -4289,7 +4763,7 @@
           <w:bCs/>
           <w:color w:val="0A234B"/>
         </w:rPr>
-        <w:t xml:space="preserve">6.1 Conventions de commit</w:t>
+        <w:t xml:space="preserve">7.1 Conventions de commit</w:t>
       </w:r>
     </w:p>
     <w:p>
@@ -4954,7 +5428,7 @@
           <w:bCs/>
           <w:color w:val="0A234B"/>
         </w:rPr>
-        <w:t xml:space="preserve">6.2 Workflow Pull Request</w:t>
+        <w:t xml:space="preserve">7.2 Workflow Pull Request</w:t>
       </w:r>
     </w:p>
     <w:p>
@@ -5001,7 +5475,7 @@
           <w:bCs/>
           <w:color w:val="0A234B"/>
         </w:rPr>
-        <w:t xml:space="preserve">6.3 Avant chaque commit</w:t>
+        <w:t xml:space="preserve">7.3 Avant chaque commit</w:t>
       </w:r>
     </w:p>
     <w:p>
@@ -5090,7 +5564,7 @@
           <w:bCs/>
           <w:color w:val="0A234B"/>
         </w:rPr>
-        <w:t xml:space="preserve">7. Points d'attention</w:t>
+        <w:t xml:space="preserve">8. Points d'attention</w:t>
       </w:r>
     </w:p>
     <w:tbl>
@@ -5323,7 +5797,7 @@
           <w:bCs/>
           <w:color w:val="0A234B"/>
         </w:rPr>
-        <w:t xml:space="preserve">8. Ressources</w:t>
+        <w:t xml:space="preserve">9. Ressources</w:t>
       </w:r>
     </w:p>
     <w:p>
@@ -5413,25 +5887,25 @@
           <w:sz w:val="22"/>
           <w:szCs w:val="22"/>
         </w:rPr>
-        <w:t xml:space="preserve">Guide d'installation pour rejoindre le projet : docs/Guide_Installation_DIAPALER.docx</w:t>
-      </w:r>
-    </w:p>
-    <w:p>
-      <w:pPr>
-        <w:pStyle w:val="ListParagraph"/>
-        <w:numPr>
-          <w:ilvl w:val="0"/>
-          <w:numId w:val="2"/>
-        </w:numPr>
-        <w:spacing w:after="40" w:before="40"/>
-      </w:pPr>
-      <w:r>
-        <w:rPr>
-          <w:color w:val="0F1729"/>
-          <w:sz w:val="22"/>
-          <w:szCs w:val="22"/>
-        </w:rPr>
-        <w:t xml:space="preserve">Doc fonctionnelle (Livrable 0 du cours) : docs externes (DOCX original)</w:t>
+        <w:t xml:space="preserve">Guide d'installation : docs/Guide_Installation_DIAPALER.docx</w:t>
+      </w:r>
+    </w:p>
+    <w:p>
+      <w:pPr>
+        <w:pStyle w:val="ListParagraph"/>
+        <w:numPr>
+          <w:ilvl w:val="0"/>
+          <w:numId w:val="2"/>
+        </w:numPr>
+        <w:spacing w:after="40" w:before="40"/>
+      </w:pPr>
+      <w:r>
+        <w:rPr>
+          <w:color w:val="0F1729"/>
+          <w:sz w:val="22"/>
+          <w:szCs w:val="22"/>
+        </w:rPr>
+        <w:t xml:space="preserve">Doc fonctionnelle (Livrable 0 du cours) : DOCX original de l'équipe</w:t>
       </w:r>
     </w:p>
     <w:p>

</xml_diff>

<commit_message>
fix(docs): convert SVG diagrams to real PNG via sharp (Word couldn't render SVG fallback)
</commit_message>
<xml_diff>
--- a/docs/Rapport_Technique_DIAPALER.docx
+++ b/docs/Rapport_Technique_DIAPALER.docx
@@ -259,7 +259,7 @@
         </w:rPr>
         <w:t xml:space="preserve">Repo : </w:t>
       </w:r>
-      <w:hyperlink w:history="1" r:id="rId4tcumancrzgwl0a9rsprg">
+      <w:hyperlink w:history="1" r:id="rId_lta87btgexp30rtd6hfa">
         <w:r>
           <w:rPr>
             <w:color w:val="1E50A0"/>
@@ -459,7 +459,7 @@
       <w:r>
         <w:drawing>
           <wp:inline distT="0" distB="0" distL="0" distR="0">
-            <wp:extent cx="5715000" cy="2381250"/>
+            <wp:extent cx="5715000" cy="2428875"/>
             <wp:effectExtent t="0" r="0" b="0" l="0"/>
             <wp:docPr id="1" name="Schéma" descr="Schéma DIAPALER" title="Schéma"/>
             <wp:cNvGraphicFramePr>
@@ -475,13 +475,7 @@
                     </pic:cNvPicPr>
                   </pic:nvPicPr>
                   <pic:blipFill>
-                    <a:blip r:embed="rId10" cstate="none">
-                      <a:extLst>
-                        <a:ext uri="{96DAC541-7B7A-43D3-8B79-37D633B846F1}">
-                          <asvg:svgBlip xmlns:asvg="http://schemas.microsoft.com/office/drawing/2016/SVG/main" r:embed="rId9"/>
-                        </a:ext>
-                      </a:extLst>
-                    </a:blip>
+                    <a:blip r:embed="rId9" cstate="none"/>
                     <a:srcRect/>
                     <a:stretch>
                       <a:fillRect/>
@@ -490,7 +484,7 @@
                   <pic:spPr bwMode="auto">
                     <a:xfrm>
                       <a:off x="0" y="0"/>
-                      <a:ext cx="5715000" cy="2381250"/>
+                      <a:ext cx="5715000" cy="2428875"/>
                     </a:xfrm>
                     <a:prstGeom prst="rect">
                       <a:avLst/>
@@ -552,13 +546,7 @@
                     </pic:cNvPicPr>
                   </pic:nvPicPr>
                   <pic:blipFill>
-                    <a:blip r:embed="rId12" cstate="none">
-                      <a:extLst>
-                        <a:ext uri="{96DAC541-7B7A-43D3-8B79-37D633B846F1}">
-                          <asvg:svgBlip xmlns:asvg="http://schemas.microsoft.com/office/drawing/2016/SVG/main" r:embed="rId11"/>
-                        </a:ext>
-                      </a:extLst>
-                    </a:blip>
+                    <a:blip r:embed="rId10" cstate="none"/>
                     <a:srcRect/>
                     <a:stretch>
                       <a:fillRect/>
@@ -613,7 +601,7 @@
       <w:r>
         <w:drawing>
           <wp:inline distT="0" distB="0" distL="0" distR="0">
-            <wp:extent cx="5715000" cy="1905000"/>
+            <wp:extent cx="5715000" cy="1790700"/>
             <wp:effectExtent t="0" r="0" b="0" l="0"/>
             <wp:docPr id="1" name="Schéma" descr="Schéma DIAPALER" title="Schéma"/>
             <wp:cNvGraphicFramePr>
@@ -629,13 +617,7 @@
                     </pic:cNvPicPr>
                   </pic:nvPicPr>
                   <pic:blipFill>
-                    <a:blip r:embed="rId14" cstate="none">
-                      <a:extLst>
-                        <a:ext uri="{96DAC541-7B7A-43D3-8B79-37D633B846F1}">
-                          <asvg:svgBlip xmlns:asvg="http://schemas.microsoft.com/office/drawing/2016/SVG/main" r:embed="rId13"/>
-                        </a:ext>
-                      </a:extLst>
-                    </a:blip>
+                    <a:blip r:embed="rId11" cstate="none"/>
                     <a:srcRect/>
                     <a:stretch>
                       <a:fillRect/>
@@ -644,7 +626,7 @@
                   <pic:spPr bwMode="auto">
                     <a:xfrm>
                       <a:off x="0" y="0"/>
-                      <a:ext cx="5715000" cy="1905000"/>
+                      <a:ext cx="5715000" cy="1790700"/>
                     </a:xfrm>
                     <a:prstGeom prst="rect">
                       <a:avLst/>
@@ -690,7 +672,7 @@
       <w:r>
         <w:drawing>
           <wp:inline distT="0" distB="0" distL="0" distR="0">
-            <wp:extent cx="5715000" cy="2667000"/>
+            <wp:extent cx="5715000" cy="2428875"/>
             <wp:effectExtent t="0" r="0" b="0" l="0"/>
             <wp:docPr id="1" name="Schéma" descr="Schéma DIAPALER" title="Schéma"/>
             <wp:cNvGraphicFramePr>
@@ -706,13 +688,7 @@
                     </pic:cNvPicPr>
                   </pic:nvPicPr>
                   <pic:blipFill>
-                    <a:blip r:embed="rId16" cstate="none">
-                      <a:extLst>
-                        <a:ext uri="{96DAC541-7B7A-43D3-8B79-37D633B846F1}">
-                          <asvg:svgBlip xmlns:asvg="http://schemas.microsoft.com/office/drawing/2016/SVG/main" r:embed="rId15"/>
-                        </a:ext>
-                      </a:extLst>
-                    </a:blip>
+                    <a:blip r:embed="rId12" cstate="none"/>
                     <a:srcRect/>
                     <a:stretch>
                       <a:fillRect/>
@@ -721,7 +697,7 @@
                   <pic:spPr bwMode="auto">
                     <a:xfrm>
                       <a:off x="0" y="0"/>
-                      <a:ext cx="5715000" cy="2667000"/>
+                      <a:ext cx="5715000" cy="2428875"/>
                     </a:xfrm>
                     <a:prstGeom prst="rect">
                       <a:avLst/>

</xml_diff>